<commit_message>
Bind corrected Genome Medicine manuscript to final DOI for v1.0.10
</commit_message>
<xml_diff>
--- a/manuscript/genome_medicine/PAPPA2_manuscript_Genome_Medicine_Research_Article_v4.docx
+++ b/manuscript/genome_medicine/PAPPA2_manuscript_Genome_Medicine_Research_Article_v4.docx
@@ -4666,7 +4666,7 @@
         <w:rPr>
           <w:b w:val="0"/>
         </w:rPr>
-        <w:t>Archived version: pending release of the v0.2.0 analysis archive</w:t>
+        <w:t>Archived version: https://doi.org/10.5281/zenodo.23811766</w:t>
       </w:r>
     </w:p>
     <w:p>
@@ -4842,7 +4842,7 @@
         <w:rPr>
           <w:b w:val="0"/>
         </w:rPr>
-        <w:t>Analysis code is available at https://github.com/ZhiPeng1022/pappa2-tal-analysis-unit-sensitivity. The versioned archive containing the signature-transfer, regulatory-support, composition-expression, and prespecified analysis-unit panel is available at the project repository. The final exact-version DOI will be inserted after the corrected v0.2.0 archive is released.</w:t>
+        <w:t>Analysis code is available at https://github.com/ZhiPeng1022/pappa2-tal-analysis-unit-sensitivity. The versioned archive containing the signature-transfer, regulatory-support, composition-expression, and prespecified analysis-unit panel is available at the project repository. The corrected v0.2.0 analysis archive is available at https://doi.org/10.5281/zenodo.23811766.</w:t>
       </w:r>
     </w:p>
     <w:p>

</xml_diff>

<commit_message>
Bind corrected Genome Medicine manuscript to final DOI for v1.0.10 (#7)
</commit_message>
<xml_diff>
--- a/manuscript/genome_medicine/PAPPA2_manuscript_Genome_Medicine_Research_Article_v4.docx
+++ b/manuscript/genome_medicine/PAPPA2_manuscript_Genome_Medicine_Research_Article_v4.docx
@@ -4666,7 +4666,7 @@
         <w:rPr>
           <w:b w:val="0"/>
         </w:rPr>
-        <w:t>Archived version: pending release of the v0.2.0 analysis archive</w:t>
+        <w:t>Archived version: https://doi.org/10.5281/zenodo.23811766</w:t>
       </w:r>
     </w:p>
     <w:p>
@@ -4842,7 +4842,7 @@
         <w:rPr>
           <w:b w:val="0"/>
         </w:rPr>
-        <w:t>Analysis code is available at https://github.com/ZhiPeng1022/pappa2-tal-analysis-unit-sensitivity. The versioned archive containing the signature-transfer, regulatory-support, composition-expression, and prespecified analysis-unit panel is available at the project repository. The final exact-version DOI will be inserted after the corrected v0.2.0 archive is released.</w:t>
+        <w:t>Analysis code is available at https://github.com/ZhiPeng1022/pappa2-tal-analysis-unit-sensitivity. The versioned archive containing the signature-transfer, regulatory-support, composition-expression, and prespecified analysis-unit panel is available at the project repository. The corrected v0.2.0 analysis archive is available at https://doi.org/10.5281/zenodo.23811766.</w:t>
       </w:r>
     </w:p>
     <w:p>

</xml_diff>